<commit_message>
Se realizaron mejoras en el frontend, mejorando la interaccion con el usuario y la fluidez. Tambien se hicieron correcciones con la generacion del SCPM-05
</commit_message>
<xml_diff>
--- a/backend/templates/1. Cédula registro actualizado 2025 COMBIANADA.docx
+++ b/backend/templates/1. Cédula registro actualizado 2025 COMBIANADA.docx
@@ -220,7 +220,6 @@
                 <w:lang w:val="es-ES"/>
               </w:rPr>
             </w:pPr>
-            <w:proofErr w:type="gramStart"/>
             <w:r>
               <w:rPr>
                 <w:bCs w:val="0"/>
@@ -230,7 +229,6 @@
               </w:rPr>
               <w:t>CURP :</w:t>
             </w:r>
-            <w:proofErr w:type="gramEnd"/>
           </w:p>
         </w:tc>
         <w:tc>
@@ -256,7 +254,6 @@
                 <w:lang w:val="es-ES"/>
               </w:rPr>
             </w:pPr>
-            <w:proofErr w:type="gramStart"/>
             <w:r>
               <w:rPr>
                 <w:bCs w:val="0"/>
@@ -275,7 +272,6 @@
               </w:rPr>
               <w:t xml:space="preserve"> </w:t>
             </w:r>
-            <w:proofErr w:type="spellStart"/>
             <w:r>
               <w:rPr>
                 <w:bCs w:val="0"/>
@@ -285,8 +281,6 @@
               </w:rPr>
               <w:t>curp</w:t>
             </w:r>
-            <w:proofErr w:type="spellEnd"/>
-            <w:proofErr w:type="gramEnd"/>
             <w:r>
               <w:rPr>
                 <w:bCs w:val="0"/>
@@ -1079,7 +1073,6 @@
                 <w:lang w:val="es-ES"/>
               </w:rPr>
             </w:pPr>
-            <w:proofErr w:type="gramStart"/>
             <w:r>
               <w:rPr>
                 <w:bCs w:val="0"/>
@@ -1105,9 +1098,26 @@
                 <w:szCs w:val="20"/>
                 <w:lang w:val="es-ES"/>
               </w:rPr>
-              <w:t>duración</w:t>
-            </w:r>
-            <w:proofErr w:type="gramEnd"/>
+              <w:t>duraci</w:t>
+            </w:r>
+            <w:r>
+              <w:rPr>
+                <w:bCs w:val="0"/>
+                <w:sz w:val="20"/>
+                <w:szCs w:val="20"/>
+                <w:lang w:val="es-ES"/>
+              </w:rPr>
+              <w:t>o</w:t>
+            </w:r>
+            <w:r>
+              <w:rPr>
+                <w:bCs w:val="0"/>
+                <w:sz w:val="20"/>
+                <w:szCs w:val="20"/>
+                <w:lang w:val="es-ES"/>
+              </w:rPr>
+              <w:t>n</w:t>
+            </w:r>
             <w:r>
               <w:rPr>
                 <w:bCs w:val="0"/>
@@ -2660,6 +2670,7 @@
                 <w:noProof/>
                 <w:sz w:val="20"/>
                 <w:szCs w:val="20"/>
+                <w:u w:val="single"/>
                 <w:lang w:val="pt-PT"/>
               </w:rPr>
             </w:pPr>
@@ -2671,47 +2682,7 @@
                 <w:szCs w:val="20"/>
                 <w:lang w:val="es-ES"/>
               </w:rPr>
-              <w:fldChar w:fldCharType="begin"/>
-            </w:r>
-            <w:r>
-              <w:rPr>
-                <w:bCs w:val="0"/>
-                <w:noProof/>
-                <w:sz w:val="20"/>
-                <w:szCs w:val="20"/>
-                <w:lang w:val="pt-PT"/>
-              </w:rPr>
-              <w:instrText xml:space="preserve"> MERGEFIELD "CATEGORIA" </w:instrText>
-            </w:r>
-            <w:r>
-              <w:rPr>
-                <w:bCs w:val="0"/>
-                <w:noProof/>
-                <w:sz w:val="20"/>
-                <w:szCs w:val="20"/>
-                <w:lang w:val="es-ES"/>
-              </w:rPr>
-              <w:fldChar w:fldCharType="separate"/>
-            </w:r>
-            <w:r>
-              <w:rPr>
-                <w:bCs w:val="0"/>
-                <w:noProof/>
-                <w:sz w:val="20"/>
-                <w:szCs w:val="20"/>
-                <w:lang w:val="pt-PT"/>
-              </w:rPr>
-              <w:t>Especialista Tecnico "C"</w:t>
-            </w:r>
-            <w:r>
-              <w:rPr>
-                <w:bCs w:val="0"/>
-                <w:noProof/>
-                <w:sz w:val="20"/>
-                <w:szCs w:val="20"/>
-                <w:lang w:val="es-ES"/>
-              </w:rPr>
-              <w:fldChar w:fldCharType="end"/>
+              <w:t>{{ categoria_trabajador }}</w:t>
             </w:r>
           </w:p>
           <w:p>
@@ -4971,19 +4942,8 @@
                 <w:szCs w:val="14"/>
                 <w:lang w:val="es-ES"/>
               </w:rPr>
-              <w:t xml:space="preserve">Documento probatorio que </w:t>
-            </w:r>
-            <w:proofErr w:type="gramStart"/>
-            <w:r>
-              <w:rPr>
-                <w:bCs w:val="0"/>
-                <w:sz w:val="14"/>
-                <w:szCs w:val="14"/>
-                <w:lang w:val="es-ES"/>
-              </w:rPr>
-              <w:t>tiene :</w:t>
-            </w:r>
-            <w:proofErr w:type="gramEnd"/>
+              <w:t>Documento probatorio que tiene :</w:t>
+            </w:r>
           </w:p>
         </w:tc>
         <w:tc>
@@ -5678,19 +5638,8 @@
                 <w:szCs w:val="14"/>
                 <w:lang w:val="es-ES"/>
               </w:rPr>
-              <w:t xml:space="preserve">(*) Año del documento </w:t>
-            </w:r>
-            <w:proofErr w:type="gramStart"/>
-            <w:r>
-              <w:rPr>
-                <w:bCs w:val="0"/>
-                <w:sz w:val="14"/>
-                <w:szCs w:val="14"/>
-                <w:lang w:val="es-ES"/>
-              </w:rPr>
-              <w:t>probatorio :</w:t>
-            </w:r>
-            <w:proofErr w:type="gramEnd"/>
+              <w:t>(*) Año del documento probatorio :</w:t>
+            </w:r>
           </w:p>
         </w:tc>
         <w:tc>
@@ -6344,19 +6293,8 @@
                 <w:szCs w:val="14"/>
                 <w:lang w:val="es-ES"/>
               </w:rPr>
-              <w:t xml:space="preserve">(*) Seleccione si tiene usted alguna </w:t>
-            </w:r>
-            <w:proofErr w:type="gramStart"/>
-            <w:r>
-              <w:rPr>
-                <w:bCs w:val="0"/>
-                <w:sz w:val="14"/>
-                <w:szCs w:val="14"/>
-                <w:lang w:val="es-ES"/>
-              </w:rPr>
-              <w:t>discapacidad :</w:t>
-            </w:r>
-            <w:proofErr w:type="gramEnd"/>
+              <w:t>(*) Seleccione si tiene usted alguna discapacidad :</w:t>
+            </w:r>
           </w:p>
         </w:tc>
         <w:tc>
@@ -7239,19 +7177,8 @@
                 <w:szCs w:val="14"/>
                 <w:lang w:val="es-ES"/>
               </w:rPr>
-              <w:t xml:space="preserve">(*) Estado </w:t>
-            </w:r>
-            <w:proofErr w:type="gramStart"/>
-            <w:r>
-              <w:rPr>
-                <w:bCs w:val="0"/>
-                <w:sz w:val="14"/>
-                <w:szCs w:val="14"/>
-                <w:lang w:val="es-ES"/>
-              </w:rPr>
-              <w:t>Civil :</w:t>
-            </w:r>
-            <w:proofErr w:type="gramEnd"/>
+              <w:t>(*) Estado Civil :</w:t>
+            </w:r>
           </w:p>
         </w:tc>
         <w:tc>

</xml_diff>